<commit_message>
Remet PROGRESS a jour sur le report de la partie III
Le .docx de travail avait ete repris a la main sans que les documents
suivent : la partie III y est collee en entier (3.1 a 3.7, treize tables
Word, deux figures), la bibliographie a recu quinze entrees numerotees et
trois placeholders sont tombes. Le tableau d'audit dit maintenant ce qui
reste, y compris ce que le collage a aggrave : le code inline de la partie
III est passe en Markdown brut.

Deux incoherences trouvees en chemin et corrigees : partie3-plan.md
annoncait 41 % la ou le chiffre arrete est 38 %, et 3.3.2 precedait 3.3.1
dans partie3.md. L'ordre est retabli, les deux renvois « ci-dessus » que
le deplacement rendait faux sont explicites, et l'export Word regenere.

Co-Authored-By: Claude Opus 5 <noreply@anthropic.com>
</commit_message>
<xml_diff>
--- a/memoire/partie3.docx
+++ b/memoire/partie3.docx
@@ -1057,77 +1057,59 @@
         <w:pStyle w:val="Heading3"/>
       </w:pPr>
       <w:r>
-        <w:t>3.3.2 Ce que ces valeurs doivent au choix de l'équilibre</w:t>
+        <w:t>3.3.1 Le contrôle négatif</w:t>
       </w:r>
     </w:p>
     <w:p>
       <w:r>
-        <w:t>L'équilibre de Kuhn est une famille à un paramètre et le protocole en a retenu un membre, α = 1/3 (§2.2.2). Il faut dire ce que les chiffres ci-dessus lui doivent, d'autant que la réponse départage nettement les énoncés.</w:t>
+        <w:t>L'adversaire jouant l'équilibre fournit une falsification interne du dispositif de mesure. Contre lui, aucune politique ne peut rapporter davantage que l'équilibre : la référence récitée ne peut pas y devenir positive, ni l'écart négatif — deux formulations d'une seule condition (§3.1). Une violation invaliderait l'ensemble des mesures de la campagne.</w:t>
       </w:r>
     </w:p>
     <w:p>
+      <w:r>
+        <w:t xml:space="preserve">Sur les trente-neuf séries jouées contre cet adversaire, </w:t>
+      </w:r>
       <w:r>
         <w:rPr>
           <w:b/>
         </w:rPr>
-        <w:t>Le résultat principal n'y doit rien.</w:t>
-      </w:r>
-      <w:r>
-        <w:t xml:space="preserve"> L'écart d'exploitation se mesure contre la meilleure réponse, dont l'espérance est indépendante de l'équilibre choisi ; il est donc α-libre, et H1 comme H3 avec lui. Il en va de même de l'énoncé central de cette section : </w:t>
-      </w:r>
-      <w:r>
-        <w:rPr>
-          <w:i/>
-        </w:rPr>
-        <w:t>atteindre exactement le maximum d'exploitation</w:t>
-      </w:r>
-      <w:r>
-        <w:t xml:space="preserve"> équivaut à </w:t>
-      </w:r>
-      <w:r>
-        <w:rPr>
-          <w:i/>
-        </w:rPr>
-        <w:t>afficher un écart nul</w:t>
-      </w:r>
-      <w:r>
-        <w:t>, puisque le maximum et l'écart somment à une constante (§3.1). La conclusion « l'agent exploite jusqu'à l'optimum » vaudrait donc à l'identique pour n'importe quel membre de la famille.</w:t>
-      </w:r>
-    </w:p>
-    <w:p>
+        <w:t>la référence récitée n'est jamais positive</w:t>
+      </w:r>
+      <w:r>
+        <w:t xml:space="preserve"> et </w:t>
+      </w:r>
       <w:r>
         <w:rPr>
           <w:b/>
         </w:rPr>
-        <w:t>L'échelle, elle, en dépend entièrement.</w:t>
-      </w:r>
-      <w:r>
-        <w:t xml:space="preserve"> L'espérance de la politique d'équilibre contre les deux adversaires biaisés passe de 1/9 à 2/9 lorsque α va de 0 à 1/3 ; le plafond de la référence récitée descend en conséquence de 8/9 à 7/9 contre Over-folder, et de 2/9 à 1/9 contre Station. Les colonnes du tableau ci-dessus sont donc lisibles à α = 1/3, et à lui seul.</w:t>
+        <w:t>l'écart jamais négatif</w:t>
+      </w:r>
+      <w:r>
+        <w:t>. Six séries atteignent exactement zéro : l'agent y joue une meilleure réponse à l'équilibre, encaissant exactement la valeur du jeu. Aucune ne dépasse. Le contrôle tient.</w:t>
       </w:r>
     </w:p>
     <w:p>
+      <w:r>
+        <w:t xml:space="preserve">Reste un fait qu'il faut interpréter et non écarter : </w:t>
+      </w:r>
       <w:r>
         <w:rPr>
           <w:b/>
         </w:rPr>
-        <w:t>Une observation change de sens selon α, et c'est celle qu'il faut nuancer.</w:t>
-      </w:r>
-      <w:r>
-        <w:t xml:space="preserve"> Le constat « sans mémoire, l'agent est en dessous de l'équilibre » vaut à α = 1/3 : il y est à −0,111 contre Station. Recalculé contre le membre α = 0 de la famille, le même agent afficherait +0,001 — soit exactement le niveau de l'équilibre. Ce que la campagne établit n'est donc pas que le modèle joue mal dans l'absolu, mais qu'</w:t>
-      </w:r>
-      <w:r>
-        <w:rPr>
-          <w:b/>
-        </w:rPr>
-        <w:t>il n'atteint pas le meilleur équilibre disponible</w:t>
-      </w:r>
-      <w:r>
-        <w:t>, ce qui est une proposition plus faible et plus exacte.</w:t>
+        <w:t>l'écart décroît aussi contre GTO</w:t>
+      </w:r>
+      <w:r>
+        <w:t>, de 0,161 à la première série à 0,008 à la dixième. Ce n'est pas un artefact, et le chapitre de méthode a été corrigé sur ce point — sa formulation initiale tenait toute décroissance contre cet adversaire pour un défaut invalidant, critère qui, pris au mot, aurait invalidé des résultats sains.</w:t>
       </w:r>
     </w:p>
     <w:p>
       <w:r>
-        <w:t>Reste que ce choix est le plus exigeant des trois : α = 1/3 est le membre de la famille qui exploite le mieux Station et Over-folder. Le récitant auquel l'agent est comparé est le plus fort que la théorie autorise, et le dépasser est donc un résultat plus fort — non plus faible — que s'il avait été comparé à un récitant plus timide.</w:t>
+        <w:t>L'explication tient à ce que l'écart mesure. Il mesure la distance à la meilleure réponse, et contre un adversaire à l'équilibre, toute meilleure réponse rapporte exactement la valeur du jeu. Un agent qui cesse de commettre des fautes grossières s'en rapproche donc sans exploiter quoi que ce soit. La distinction entre les deux lectures est tranchée par la condition sans mémoire : si cette décroissance venait de l'instrument, elle s'y observerait aussi, sur les mêmes distributions et le même calcul. Elle ne s'y observe pas.</w:t>
+      </w:r>
+    </w:p>
+    <w:p>
+      <w:r>
+        <w:t>Contre GTO, la mémoire ne sert donc qu'à corriger des erreurs propres — et l'on notera que l'écart n'y atteint jamais zéro de façon stable, contrairement aux deux adversaires exploitables. La section 3.6 montrera pourquoi.</w:t>
       </w:r>
     </w:p>
     <w:p>
@@ -1135,59 +1117,77 @@
         <w:pStyle w:val="Heading3"/>
       </w:pPr>
       <w:r>
-        <w:t>3.3.1 Le contrôle négatif</w:t>
+        <w:t>3.3.2 Ce que ces valeurs doivent au choix de l'équilibre</w:t>
       </w:r>
     </w:p>
     <w:p>
       <w:r>
-        <w:t>L'adversaire jouant l'équilibre fournit une falsification interne du dispositif de mesure. Contre lui, aucune politique ne peut rapporter davantage que l'équilibre : la référence récitée ne peut pas y devenir positive, ni l'écart négatif — deux formulations d'une seule condition (§3.1). Une violation invaliderait l'ensemble des mesures de la campagne.</w:t>
+        <w:t>L'équilibre de Kuhn est une famille à un paramètre et le protocole en a retenu un membre, α = 1/3 (§2.2.2). Il faut dire ce que les chiffres de cette section lui doivent, d'autant que la réponse départage nettement les énoncés.</w:t>
       </w:r>
     </w:p>
     <w:p>
-      <w:r>
-        <w:t xml:space="preserve">Sur les trente-neuf séries jouées contre cet adversaire, </w:t>
-      </w:r>
       <w:r>
         <w:rPr>
           <w:b/>
         </w:rPr>
-        <w:t>la référence récitée n'est jamais positive</w:t>
-      </w:r>
-      <w:r>
-        <w:t xml:space="preserve"> et </w:t>
-      </w:r>
+        <w:t>Le résultat principal n'y doit rien.</w:t>
+      </w:r>
+      <w:r>
+        <w:t xml:space="preserve"> L'écart d'exploitation se mesure contre la meilleure réponse, dont l'espérance est indépendante de l'équilibre choisi ; il est donc α-libre, et H1 comme H3 avec lui. Il en va de même de l'énoncé central de cette section : </w:t>
+      </w:r>
+      <w:r>
+        <w:rPr>
+          <w:i/>
+        </w:rPr>
+        <w:t>atteindre exactement le maximum d'exploitation</w:t>
+      </w:r>
+      <w:r>
+        <w:t xml:space="preserve"> équivaut à </w:t>
+      </w:r>
+      <w:r>
+        <w:rPr>
+          <w:i/>
+        </w:rPr>
+        <w:t>afficher un écart nul</w:t>
+      </w:r>
+      <w:r>
+        <w:t>, puisque le maximum et l'écart somment à une constante (§3.1). La conclusion « l'agent exploite jusqu'à l'optimum » vaudrait donc à l'identique pour n'importe quel membre de la famille.</w:t>
+      </w:r>
+    </w:p>
+    <w:p>
       <w:r>
         <w:rPr>
           <w:b/>
         </w:rPr>
-        <w:t>l'écart jamais négatif</w:t>
-      </w:r>
-      <w:r>
-        <w:t>. Six séries atteignent exactement zéro : l'agent y joue une meilleure réponse à l'équilibre, encaissant exactement la valeur du jeu. Aucune ne dépasse. Le contrôle tient.</w:t>
+        <w:t>L'échelle, elle, en dépend entièrement.</w:t>
+      </w:r>
+      <w:r>
+        <w:t xml:space="preserve"> L'espérance de la politique d'équilibre contre les deux adversaires biaisés passe de 1/9 à 2/9 lorsque α va de 0 à 1/3 ; le plafond de la référence récitée descend en conséquence de 8/9 à 7/9 contre Over-folder, et de 2/9 à 1/9 contre Station. Les colonnes du tableau d'ouverture de cette section sont donc lisibles à α = 1/3, et à lui seul.</w:t>
       </w:r>
     </w:p>
     <w:p>
-      <w:r>
-        <w:t xml:space="preserve">Reste un fait qu'il faut interpréter et non écarter : </w:t>
-      </w:r>
       <w:r>
         <w:rPr>
           <w:b/>
         </w:rPr>
-        <w:t>l'écart décroît aussi contre GTO</w:t>
-      </w:r>
-      <w:r>
-        <w:t>, de 0,161 à la première série à 0,008 à la dixième. Ce n'est pas un artefact, et le chapitre de méthode a été corrigé sur ce point — sa formulation initiale tenait toute décroissance contre cet adversaire pour un défaut invalidant, critère qui, pris au mot, aurait invalidé des résultats sains.</w:t>
+        <w:t>Une observation change de sens selon α, et c'est celle qu'il faut nuancer.</w:t>
+      </w:r>
+      <w:r>
+        <w:t xml:space="preserve"> Le constat « sans mémoire, l'agent est en dessous de l'équilibre » vaut à α = 1/3 : il y est à −0,111 contre Station. Recalculé contre le membre α = 0 de la famille, le même agent afficherait +0,001 — soit exactement le niveau de l'équilibre. Ce que la campagne établit n'est donc pas que le modèle joue mal dans l'absolu, mais qu'</w:t>
+      </w:r>
+      <w:r>
+        <w:rPr>
+          <w:b/>
+        </w:rPr>
+        <w:t>il n'atteint pas le meilleur équilibre disponible</w:t>
+      </w:r>
+      <w:r>
+        <w:t>, ce qui est une proposition plus faible et plus exacte.</w:t>
       </w:r>
     </w:p>
     <w:p>
       <w:r>
-        <w:t>L'explication tient à ce que l'écart mesure. Il mesure la distance à la meilleure réponse, et contre un adversaire à l'équilibre, toute meilleure réponse rapporte exactement la valeur du jeu. Un agent qui cesse de commettre des fautes grossières s'en rapproche donc sans exploiter quoi que ce soit. La distinction entre les deux lectures est tranchée par la condition sans mémoire : si cette décroissance venait de l'instrument, elle s'y observerait aussi, sur les mêmes distributions et le même calcul. Elle ne s'y observe pas.</w:t>
-      </w:r>
-    </w:p>
-    <w:p>
-      <w:r>
-        <w:t>Contre GTO, la mémoire ne sert donc qu'à corriger des erreurs propres — et l'on notera que l'écart n'y atteint jamais zéro de façon stable, contrairement aux deux adversaires exploitables. La section 3.6 montrera pourquoi.</w:t>
+        <w:t>Reste que ce choix est le plus exigeant des trois : α = 1/3 est le membre de la famille qui exploite le mieux Station et Over-folder. Le récitant auquel l'agent est comparé est le plus fort que la théorie autorise, et le dépasser est donc un résultat plus fort — non plus faible — que s'il avait été comparé à un récitant plus timide.</w:t>
       </w:r>
     </w:p>
     <w:p>

</xml_diff>